<commit_message>
update assignments and reports
</commit_message>
<xml_diff>
--- a/assignments/SE - Statement of Work.docx
+++ b/assignments/SE - Statement of Work.docx
@@ -31,20 +31,6 @@
     </w:p>
     <w:p>
       <w:pPr>
-        <w:pStyle w:val="Author"/>
-      </w:pPr>
-      <w:r>
-        <w:t>–</w:t>
-      </w:r>
-      <w:r>
-        <w:t>Abhishek</w:t>
-      </w:r>
-      <w:r>
-        <w:t xml:space="preserve"> Saraf</w:t>
-      </w:r>
-    </w:p>
-    <w:p>
-      <w:pPr>
         <w:pStyle w:val="List-Heading"/>
         <w:numPr>
           <w:ilvl w:val="0"/>
@@ -53,6 +39,22 @@
         <w:spacing w:line="276" w:lineRule="auto"/>
         <w:ind w:left="360" w:hanging="360"/>
       </w:pPr>
+    </w:p>
+    <w:p>
+      <w:pPr>
+        <w:pStyle w:val="Text"/>
+      </w:pPr>
+    </w:p>
+    <w:p>
+      <w:pPr>
+        <w:pStyle w:val="List-Heading"/>
+        <w:numPr>
+          <w:ilvl w:val="0"/>
+          <w:numId w:val="0"/>
+        </w:numPr>
+        <w:spacing w:line="276" w:lineRule="auto"/>
+        <w:ind w:left="360" w:hanging="360"/>
+      </w:pPr>
       <w:r>
         <w:t>Abstract</w:t>
       </w:r>
@@ -62,31 +64,7 @@
         <w:pStyle w:val="Text"/>
       </w:pPr>
       <w:r>
-        <w:t xml:space="preserve">Digital payment fraud has become a critical challenge in India's rapidly growing UPI ecosystem. Traditional fraud detection systems react after transactions are completed, making them ineffective in preventing losses. This project presents ARGUS (Advanced Real-time Guard &amp; User Security), an AI-powered fraud prevention system that evaluates transaction risk before payment authorization. Using machine learning techniques including </w:t>
-      </w:r>
-      <w:proofErr w:type="spellStart"/>
-      <w:r>
-        <w:t>XGBoost</w:t>
-      </w:r>
-      <w:proofErr w:type="spellEnd"/>
-      <w:r>
-        <w:t xml:space="preserve"> gradient boosting and Isolation Forest anomaly detection, ARGUS </w:t>
-      </w:r>
-      <w:proofErr w:type="spellStart"/>
-      <w:r>
-        <w:t>analyzes</w:t>
-      </w:r>
-      <w:proofErr w:type="spellEnd"/>
-      <w:r>
-        <w:t xml:space="preserve"> transaction patterns, user </w:t>
-      </w:r>
-      <w:proofErr w:type="spellStart"/>
-      <w:r>
-        <w:t>behavior</w:t>
-      </w:r>
-      <w:proofErr w:type="spellEnd"/>
-      <w:r>
-        <w:t>, device information, and velocity metrics to identify fraudulent activities in real-time. The system specifically addresses India-specific fraud patterns such as digital arrest scams, SIM swap attacks, and mule account networks. Our goal is to build a working prototype that demonstrates pre-authorization fraud detection, provides explainable AI decisions, and maintains high detection accuracy while minimizing false positives. This document outlines the project vision, objectives, system architecture, implementation plan, and expected outcomes for the ARGUS fraud detection platform.</w:t>
+        <w:t>Digital payment fraud has become a critical challenge in India's rapidly growing UPI ecosystem. Traditional fraud detection systems react after transactions are completed, making them ineffective in preventing losses. This project presents ARGUS (Advanced Real-time Guard &amp; User Security), an AI-powered fraud prevention system that evaluates transaction risk before payment authorization. Using machine learning techniques including XGBoost gradient boosting and Isolation Forest anomaly detection, ARGUS analyzes transaction patterns, user behavior, device information, and velocity metrics to identify fraudulent activities in real-time. The system specifically addresses India-specific fraud patterns such as digital arrest scams, SIM swap attacks, and mule account networks. Our goal is to build a working prototype that demonstrates pre-authorization fraud detection, provides explainable AI decisions, and maintains high detection accuracy while minimizing false positives. This document outlines the project vision, objectives, system architecture, implementation plan, and expected outcomes for the ARGUS fraud detection platform.</w:t>
       </w:r>
     </w:p>
     <w:p>
@@ -250,35 +228,7 @@
         <w:rPr>
           <w:rFonts w:ascii="Times New Roman" w:hAnsi="Times New Roman" w:cs="Times New Roman"/>
         </w:rPr>
-        <w:t xml:space="preserve"> Rule-based systems lack the sophistication to </w:t>
-      </w:r>
-      <w:proofErr w:type="spellStart"/>
-      <w:r>
-        <w:rPr>
-          <w:rFonts w:ascii="Times New Roman" w:hAnsi="Times New Roman" w:cs="Times New Roman"/>
-        </w:rPr>
-        <w:t>analyze</w:t>
-      </w:r>
-      <w:proofErr w:type="spellEnd"/>
-      <w:r>
-        <w:rPr>
-          <w:rFonts w:ascii="Times New Roman" w:hAnsi="Times New Roman" w:cs="Times New Roman"/>
-        </w:rPr>
-        <w:t xml:space="preserve"> </w:t>
-      </w:r>
-      <w:proofErr w:type="spellStart"/>
-      <w:r>
-        <w:rPr>
-          <w:rFonts w:ascii="Times New Roman" w:hAnsi="Times New Roman" w:cs="Times New Roman"/>
-        </w:rPr>
-        <w:t>behavioral</w:t>
-      </w:r>
-      <w:proofErr w:type="spellEnd"/>
-      <w:r>
-        <w:rPr>
-          <w:rFonts w:ascii="Times New Roman" w:hAnsi="Times New Roman" w:cs="Times New Roman"/>
-        </w:rPr>
-        <w:t xml:space="preserve"> patterns, device characteristics, transaction velocity, and user context simultaneously. They miss sophisticated fraud while blocking legitimate customers.</w:t>
+        <w:t xml:space="preserve"> Rule-based systems lack the sophistication to analyze behavioral patterns, device characteristics, transaction velocity, and user context simultaneously. They miss sophisticated fraud while blocking legitimate customers.</w:t>
       </w:r>
     </w:p>
     <w:p>
@@ -380,35 +330,7 @@
         <w:rPr>
           <w:rFonts w:ascii="Times New Roman" w:hAnsi="Times New Roman" w:cs="Times New Roman"/>
         </w:rPr>
-        <w:t xml:space="preserve"> ARGUS employs an ensemble approach combining supervised learning (</w:t>
-      </w:r>
-      <w:proofErr w:type="spellStart"/>
-      <w:r>
-        <w:rPr>
-          <w:rFonts w:ascii="Times New Roman" w:hAnsi="Times New Roman" w:cs="Times New Roman"/>
-        </w:rPr>
-        <w:t>XGBoost</w:t>
-      </w:r>
-      <w:proofErr w:type="spellEnd"/>
-      <w:r>
-        <w:rPr>
-          <w:rFonts w:ascii="Times New Roman" w:hAnsi="Times New Roman" w:cs="Times New Roman"/>
-        </w:rPr>
-        <w:t xml:space="preserve"> gradient boosting), unsupervised anomaly detection (Isolation Forest), graph neural networks for fraud ring identification, and deep learning sequence models (LSTM/Transformer) for </w:t>
-      </w:r>
-      <w:proofErr w:type="spellStart"/>
-      <w:r>
-        <w:rPr>
-          <w:rFonts w:ascii="Times New Roman" w:hAnsi="Times New Roman" w:cs="Times New Roman"/>
-        </w:rPr>
-        <w:t>behavioral</w:t>
-      </w:r>
-      <w:proofErr w:type="spellEnd"/>
-      <w:r>
-        <w:rPr>
-          <w:rFonts w:ascii="Times New Roman" w:hAnsi="Times New Roman" w:cs="Times New Roman"/>
-        </w:rPr>
-        <w:t xml:space="preserve"> pattern analysis. This heterogeneous model architecture achieves 98.7% detection accuracy with 96.8% F1 score, significantly outperforming industry benchmarks.</w:t>
+        <w:t xml:space="preserve"> ARGUS employs an ensemble approach combining supervised learning (XGBoost gradient boosting), unsupervised anomaly detection (Isolation Forest), graph neural networks for fraud ring identification, and deep learning sequence models (LSTM/Transformer) for behavioral pattern analysis. This heterogeneous model architecture achieves 98.7% detection accuracy with 96.8% F1 score, significantly outperforming industry benchmarks.</w:t>
       </w:r>
     </w:p>
     <w:p>
@@ -436,21 +358,7 @@
         <w:rPr>
           <w:rFonts w:ascii="Times New Roman" w:hAnsi="Times New Roman" w:cs="Times New Roman"/>
         </w:rPr>
-        <w:t xml:space="preserve"> The system aggregates 45+ features across multiple dimensions including transactional attributes, </w:t>
-      </w:r>
-      <w:proofErr w:type="spellStart"/>
-      <w:r>
-        <w:rPr>
-          <w:rFonts w:ascii="Times New Roman" w:hAnsi="Times New Roman" w:cs="Times New Roman"/>
-        </w:rPr>
-        <w:t>behavioral</w:t>
-      </w:r>
-      <w:proofErr w:type="spellEnd"/>
-      <w:r>
-        <w:rPr>
-          <w:rFonts w:ascii="Times New Roman" w:hAnsi="Times New Roman" w:cs="Times New Roman"/>
-        </w:rPr>
-        <w:t xml:space="preserve"> biometrics, device intelligence (fingerprinting, reputation scoring), geolocation analysis (VPN/proxy detection, impossible travel calculation), merchant risk profiling, and temporal velocity tracking across </w:t>
+        <w:t xml:space="preserve"> The system aggregates 45+ features across multiple dimensions including transactional attributes, behavioral biometrics, device intelligence (fingerprinting, reputation scoring), geolocation analysis (VPN/proxy detection, impossible travel calculation), merchant risk profiling, and temporal velocity tracking across </w:t>
       </w:r>
       <w:r>
         <w:rPr>
@@ -1217,15 +1125,7 @@
         <w:pStyle w:val="ListText"/>
       </w:pPr>
       <w:r>
-        <w:t xml:space="preserve">Implement detection capabilities for India's unique fraud patterns including digital arrest scams, SIM swap attacks, mule account networks, and UPI phishing. The system will incorporate relevant keyword analysis and </w:t>
-      </w:r>
-      <w:proofErr w:type="spellStart"/>
-      <w:r>
-        <w:t>behavioral</w:t>
-      </w:r>
-      <w:proofErr w:type="spellEnd"/>
-      <w:r>
-        <w:t xml:space="preserve"> patterns specific to these attack types.</w:t>
+        <w:t>Implement detection capabilities for India's unique fraud patterns including digital arrest scams, SIM swap attacks, mule account networks, and UPI phishing. The system will incorporate relevant keyword analysis and behavioral patterns specific to these attack types.</w:t>
       </w:r>
     </w:p>
     <w:p>
@@ -1504,15 +1404,7 @@
         <w:pStyle w:val="FunctionRequirements"/>
       </w:pPr>
       <w:r>
-        <w:t xml:space="preserve">FR-2.1: Ensemble architecture combining </w:t>
-      </w:r>
-      <w:proofErr w:type="spellStart"/>
-      <w:r>
-        <w:t>XGBoost</w:t>
-      </w:r>
-      <w:proofErr w:type="spellEnd"/>
-      <w:r>
-        <w:t xml:space="preserve"> gradient boosting, Isolation Forest anomaly detection, and deep neural networks</w:t>
+        <w:t>FR-2.1: Ensemble architecture combining XGBoost gradient boosting, Isolation Forest anomaly detection, and deep neural networks</w:t>
       </w:r>
     </w:p>
     <w:p>
@@ -1520,15 +1412,7 @@
         <w:pStyle w:val="FunctionRequirements"/>
       </w:pPr>
       <w:r>
-        <w:t xml:space="preserve">FR-2.2: Feature engineering pipeline generating 45+ features across transaction, </w:t>
-      </w:r>
-      <w:proofErr w:type="spellStart"/>
-      <w:r>
-        <w:t>behavioral</w:t>
-      </w:r>
-      <w:proofErr w:type="spellEnd"/>
-      <w:r>
-        <w:t>, device, and network dimensions</w:t>
+        <w:t>FR-2.2: Feature engineering pipeline generating 45+ features across transaction, behavioral, device, and network dimensions</w:t>
       </w:r>
     </w:p>
     <w:p>
@@ -1582,15 +1466,7 @@
         <w:pStyle w:val="Non-functionalRequirements"/>
       </w:pPr>
       <w:r>
-        <w:t>NFR-2.2: Training pipeline scalability to process 10M+ transactions daily with &lt;</w:t>
-      </w:r>
-      <w:proofErr w:type="gramStart"/>
-      <w:r>
-        <w:t>6 hour</w:t>
-      </w:r>
-      <w:proofErr w:type="gramEnd"/>
-      <w:r>
-        <w:t xml:space="preserve"> latency</w:t>
+        <w:t>NFR-2.2: Training pipeline scalability to process 10M+ transactions daily with &lt;6 hour latency</w:t>
       </w:r>
     </w:p>
     <w:p>
@@ -1653,15 +1529,7 @@
         <w:pStyle w:val="FunctionRequirements"/>
       </w:pPr>
       <w:r>
-        <w:t xml:space="preserve">FR-3.3: Mule account identification </w:t>
-      </w:r>
-      <w:proofErr w:type="spellStart"/>
-      <w:r>
-        <w:t>analyzing</w:t>
-      </w:r>
-      <w:proofErr w:type="spellEnd"/>
-      <w:r>
-        <w:t xml:space="preserve"> rapid in-out transaction patterns, dormant account reactivation, and graph centrality</w:t>
+        <w:t>FR-3.3: Mule account identification analyzing rapid in-out transaction patterns, dormant account reactivation, and graph centrality</w:t>
       </w:r>
     </w:p>
     <w:p>
@@ -1782,15 +1650,7 @@
         <w:pStyle w:val="FunctionRequirements"/>
       </w:pPr>
       <w:r>
-        <w:t xml:space="preserve">FR-4.3: Contextual anomaly descriptions for velocity violations, geographic impossibilities, and </w:t>
-      </w:r>
-      <w:proofErr w:type="spellStart"/>
-      <w:r>
-        <w:t>behavioral</w:t>
-      </w:r>
-      <w:proofErr w:type="spellEnd"/>
-      <w:r>
-        <w:t xml:space="preserve"> deviations</w:t>
+        <w:t>FR-4.3: Contextual anomaly descriptions for velocity violations, geographic impossibilities, and behavioral deviations</w:t>
       </w:r>
     </w:p>
     <w:p>
@@ -2136,15 +1996,7 @@
         <w:pStyle w:val="FunctionRequirements"/>
       </w:pPr>
       <w:r>
-        <w:t xml:space="preserve">FR-7.3: PostgreSQL with </w:t>
-      </w:r>
-      <w:proofErr w:type="spellStart"/>
-      <w:r>
-        <w:t>TimescaleDB</w:t>
-      </w:r>
-      <w:proofErr w:type="spellEnd"/>
-      <w:r>
-        <w:t xml:space="preserve"> extension for time-series transaction analytics and metric aggregation</w:t>
+        <w:t>FR-7.3: PostgreSQL with TimescaleDB extension for time-series transaction analytics and metric aggregation</w:t>
       </w:r>
     </w:p>
     <w:p>
@@ -2420,13 +2272,8 @@
           <w:numId w:val="16"/>
         </w:numPr>
       </w:pPr>
-      <w:proofErr w:type="spellStart"/>
-      <w:r>
-        <w:t>FastAPI</w:t>
-      </w:r>
-      <w:proofErr w:type="spellEnd"/>
-      <w:r>
-        <w:t xml:space="preserve"> application servers (Python 3.11+)</w:t>
+      <w:r>
+        <w:t>FastAPI application servers (Python 3.11+)</w:t>
       </w:r>
     </w:p>
     <w:p>
@@ -2595,13 +2442,8 @@
           <w:numId w:val="16"/>
         </w:numPr>
       </w:pPr>
-      <w:proofErr w:type="spellStart"/>
-      <w:r>
-        <w:t>TimescaleDB</w:t>
-      </w:r>
-      <w:proofErr w:type="spellEnd"/>
-      <w:r>
-        <w:t>: Time-series analytics and metrics</w:t>
+      <w:r>
+        <w:t>TimescaleDB: Time-series analytics and metrics</w:t>
       </w:r>
     </w:p>
     <w:p>
@@ -2674,15 +2516,7 @@
         </w:numPr>
       </w:pPr>
       <w:r>
-        <w:t>Load balancing (NGINX/</w:t>
-      </w:r>
-      <w:proofErr w:type="spellStart"/>
-      <w:r>
-        <w:t>HAProxy</w:t>
-      </w:r>
-      <w:proofErr w:type="spellEnd"/>
-      <w:r>
-        <w:t>)</w:t>
+        <w:t>Load balancing (NGINX/HAProxy)</w:t>
       </w:r>
     </w:p>
     <w:p>
@@ -2762,35 +2596,7 @@
         <w:rPr>
           <w:rFonts w:ascii="Times New Roman" w:hAnsi="Times New Roman" w:cs="Times New Roman"/>
         </w:rPr>
-        <w:t xml:space="preserve">Framework: </w:t>
-      </w:r>
-      <w:proofErr w:type="spellStart"/>
-      <w:r>
-        <w:rPr>
-          <w:rFonts w:ascii="Times New Roman" w:hAnsi="Times New Roman" w:cs="Times New Roman"/>
-        </w:rPr>
-        <w:t>FastAPI</w:t>
-      </w:r>
-      <w:proofErr w:type="spellEnd"/>
-      <w:r>
-        <w:rPr>
-          <w:rFonts w:ascii="Times New Roman" w:hAnsi="Times New Roman" w:cs="Times New Roman"/>
-        </w:rPr>
-        <w:t xml:space="preserve"> 0.100+ (async/</w:t>
-      </w:r>
-      <w:proofErr w:type="gramStart"/>
-      <w:r>
-        <w:rPr>
-          <w:rFonts w:ascii="Times New Roman" w:hAnsi="Times New Roman" w:cs="Times New Roman"/>
-        </w:rPr>
-        <w:t>await</w:t>
-      </w:r>
-      <w:proofErr w:type="gramEnd"/>
-      <w:r>
-        <w:rPr>
-          <w:rFonts w:ascii="Times New Roman" w:hAnsi="Times New Roman" w:cs="Times New Roman"/>
-        </w:rPr>
-        <w:t xml:space="preserve"> for high concurrency)</w:t>
+        <w:t>Framework: FastAPI 0.100+ (async/await for high concurrency)</w:t>
       </w:r>
     </w:p>
     <w:p>
@@ -2808,35 +2614,7 @@
         <w:rPr>
           <w:rFonts w:ascii="Times New Roman" w:hAnsi="Times New Roman" w:cs="Times New Roman"/>
         </w:rPr>
-        <w:t xml:space="preserve">ML Libraries: </w:t>
-      </w:r>
-      <w:proofErr w:type="spellStart"/>
-      <w:r>
-        <w:rPr>
-          <w:rFonts w:ascii="Times New Roman" w:hAnsi="Times New Roman" w:cs="Times New Roman"/>
-        </w:rPr>
-        <w:t>XGBoost</w:t>
-      </w:r>
-      <w:proofErr w:type="spellEnd"/>
-      <w:r>
-        <w:rPr>
-          <w:rFonts w:ascii="Times New Roman" w:hAnsi="Times New Roman" w:cs="Times New Roman"/>
-        </w:rPr>
-        <w:t xml:space="preserve"> 2.0+, scikit-learn 1.3+, </w:t>
-      </w:r>
-      <w:proofErr w:type="spellStart"/>
-      <w:r>
-        <w:rPr>
-          <w:rFonts w:ascii="Times New Roman" w:hAnsi="Times New Roman" w:cs="Times New Roman"/>
-        </w:rPr>
-        <w:t>PyTorch</w:t>
-      </w:r>
-      <w:proofErr w:type="spellEnd"/>
-      <w:r>
-        <w:rPr>
-          <w:rFonts w:ascii="Times New Roman" w:hAnsi="Times New Roman" w:cs="Times New Roman"/>
-        </w:rPr>
-        <w:t xml:space="preserve"> 2.0+</w:t>
+        <w:t>ML Libraries: XGBoost 2.0+, scikit-learn 1.3+, PyTorch 2.0+</w:t>
       </w:r>
     </w:p>
     <w:p>
@@ -2854,21 +2632,7 @@
         <w:rPr>
           <w:rFonts w:ascii="Times New Roman" w:hAnsi="Times New Roman" w:cs="Times New Roman"/>
         </w:rPr>
-        <w:t xml:space="preserve">Graph Analytics: </w:t>
-      </w:r>
-      <w:proofErr w:type="spellStart"/>
-      <w:r>
-        <w:rPr>
-          <w:rFonts w:ascii="Times New Roman" w:hAnsi="Times New Roman" w:cs="Times New Roman"/>
-        </w:rPr>
-        <w:t>NetworkX</w:t>
-      </w:r>
-      <w:proofErr w:type="spellEnd"/>
-      <w:r>
-        <w:rPr>
-          <w:rFonts w:ascii="Times New Roman" w:hAnsi="Times New Roman" w:cs="Times New Roman"/>
-        </w:rPr>
-        <w:t>, graph-tool</w:t>
+        <w:t>Graph Analytics: NetworkX, graph-tool</w:t>
       </w:r>
     </w:p>
     <w:p>
@@ -2955,21 +2719,7 @@
         <w:rPr>
           <w:rFonts w:ascii="Times New Roman" w:hAnsi="Times New Roman" w:cs="Times New Roman"/>
         </w:rPr>
-        <w:t xml:space="preserve">State Management: </w:t>
-      </w:r>
-      <w:proofErr w:type="spellStart"/>
-      <w:r>
-        <w:rPr>
-          <w:rFonts w:ascii="Times New Roman" w:hAnsi="Times New Roman" w:cs="Times New Roman"/>
-        </w:rPr>
-        <w:t>Zustand</w:t>
-      </w:r>
-      <w:proofErr w:type="spellEnd"/>
-      <w:r>
-        <w:rPr>
-          <w:rFonts w:ascii="Times New Roman" w:hAnsi="Times New Roman" w:cs="Times New Roman"/>
-        </w:rPr>
-        <w:t>/Redux Toolkit</w:t>
+        <w:t>State Management: Zustand/Redux Toolkit</w:t>
       </w:r>
     </w:p>
     <w:p>
@@ -3038,21 +2788,7 @@
         <w:rPr>
           <w:rFonts w:ascii="Times New Roman" w:hAnsi="Times New Roman" w:cs="Times New Roman"/>
         </w:rPr>
-        <w:t xml:space="preserve">Relational: PostgreSQL 15+ with </w:t>
-      </w:r>
-      <w:proofErr w:type="spellStart"/>
-      <w:r>
-        <w:rPr>
-          <w:rFonts w:ascii="Times New Roman" w:hAnsi="Times New Roman" w:cs="Times New Roman"/>
-        </w:rPr>
-        <w:t>pgvector</w:t>
-      </w:r>
-      <w:proofErr w:type="spellEnd"/>
-      <w:r>
-        <w:rPr>
-          <w:rFonts w:ascii="Times New Roman" w:hAnsi="Times New Roman" w:cs="Times New Roman"/>
-        </w:rPr>
-        <w:t xml:space="preserve"> for embeddings</w:t>
+        <w:t>Relational: PostgreSQL 15+ with pgvector for embeddings</w:t>
       </w:r>
     </w:p>
     <w:p>
@@ -3070,21 +2806,7 @@
         <w:rPr>
           <w:rFonts w:ascii="Times New Roman" w:hAnsi="Times New Roman" w:cs="Times New Roman"/>
         </w:rPr>
-        <w:t xml:space="preserve">Time-Series: </w:t>
-      </w:r>
-      <w:proofErr w:type="spellStart"/>
-      <w:r>
-        <w:rPr>
-          <w:rFonts w:ascii="Times New Roman" w:hAnsi="Times New Roman" w:cs="Times New Roman"/>
-        </w:rPr>
-        <w:t>TimescaleDB</w:t>
-      </w:r>
-      <w:proofErr w:type="spellEnd"/>
-      <w:r>
-        <w:rPr>
-          <w:rFonts w:ascii="Times New Roman" w:hAnsi="Times New Roman" w:cs="Times New Roman"/>
-        </w:rPr>
-        <w:t xml:space="preserve"> extension for metrics</w:t>
+        <w:t>Time-Series: TimescaleDB extension for metrics</w:t>
       </w:r>
     </w:p>
     <w:p>
@@ -3138,21 +2860,7 @@
         <w:rPr>
           <w:rFonts w:ascii="Times New Roman" w:hAnsi="Times New Roman" w:cs="Times New Roman"/>
         </w:rPr>
-        <w:t xml:space="preserve">Object Storage: </w:t>
-      </w:r>
-      <w:proofErr w:type="spellStart"/>
-      <w:r>
-        <w:rPr>
-          <w:rFonts w:ascii="Times New Roman" w:hAnsi="Times New Roman" w:cs="Times New Roman"/>
-        </w:rPr>
-        <w:t>MinIO</w:t>
-      </w:r>
-      <w:proofErr w:type="spellEnd"/>
-      <w:r>
-        <w:rPr>
-          <w:rFonts w:ascii="Times New Roman" w:hAnsi="Times New Roman" w:cs="Times New Roman"/>
-        </w:rPr>
-        <w:t>/S3 for model and log storage</w:t>
+        <w:t>Object Storage: MinIO/S3 for model and log storage</w:t>
       </w:r>
     </w:p>
     <w:p>
@@ -3277,21 +2985,7 @@
         <w:rPr>
           <w:rFonts w:ascii="Times New Roman" w:hAnsi="Times New Roman" w:cs="Times New Roman"/>
         </w:rPr>
-        <w:t xml:space="preserve">Service Mesh: Istio for </w:t>
-      </w:r>
-      <w:proofErr w:type="spellStart"/>
-      <w:r>
-        <w:rPr>
-          <w:rFonts w:ascii="Times New Roman" w:hAnsi="Times New Roman" w:cs="Times New Roman"/>
-        </w:rPr>
-        <w:t>mTLS</w:t>
-      </w:r>
-      <w:proofErr w:type="spellEnd"/>
-      <w:r>
-        <w:rPr>
-          <w:rFonts w:ascii="Times New Roman" w:hAnsi="Times New Roman" w:cs="Times New Roman"/>
-        </w:rPr>
-        <w:t xml:space="preserve"> and traffic management</w:t>
+        <w:t>Service Mesh: Istio for mTLS and traffic management</w:t>
       </w:r>
     </w:p>
     <w:p>
@@ -3309,30 +3003,8 @@
         <w:rPr>
           <w:rFonts w:ascii="Times New Roman" w:hAnsi="Times New Roman" w:cs="Times New Roman"/>
         </w:rPr>
-        <w:t xml:space="preserve">CI/CD: GitHub Actions, </w:t>
-      </w:r>
-      <w:proofErr w:type="spellStart"/>
-      <w:r>
-        <w:rPr>
-          <w:rFonts w:ascii="Times New Roman" w:hAnsi="Times New Roman" w:cs="Times New Roman"/>
-        </w:rPr>
-        <w:t>ArgoCD</w:t>
-      </w:r>
-      <w:proofErr w:type="spellEnd"/>
-      <w:r>
-        <w:rPr>
-          <w:rFonts w:ascii="Times New Roman" w:hAnsi="Times New Roman" w:cs="Times New Roman"/>
-        </w:rPr>
-        <w:t xml:space="preserve"> for </w:t>
-      </w:r>
-      <w:proofErr w:type="spellStart"/>
-      <w:r>
-        <w:rPr>
-          <w:rFonts w:ascii="Times New Roman" w:hAnsi="Times New Roman" w:cs="Times New Roman"/>
-        </w:rPr>
-        <w:t>GitOps</w:t>
-      </w:r>
-      <w:proofErr w:type="spellEnd"/>
+        <w:t>CI/CD: GitHub Actions, ArgoCD for GitOps</w:t>
+      </w:r>
     </w:p>
     <w:p>
       <w:pPr>
@@ -3658,13 +3330,8 @@
           <w:numId w:val="27"/>
         </w:numPr>
       </w:pPr>
-      <w:proofErr w:type="spellStart"/>
-      <w:r>
-        <w:t>XGBoost</w:t>
-      </w:r>
-      <w:proofErr w:type="spellEnd"/>
-      <w:r>
-        <w:t xml:space="preserve"> ensemble prediction</w:t>
+      <w:r>
+        <w:t>XGBoost ensemble prediction</w:t>
       </w:r>
     </w:p>
     <w:p>
@@ -3944,24 +3611,41 @@
         </w:numPr>
         <w:ind w:left="1276"/>
       </w:pPr>
-      <w:proofErr w:type="spellStart"/>
       <w:r>
         <w:rPr>
           <w:b/>
           <w:bCs/>
         </w:rPr>
-        <w:t>Razorpay</w:t>
-      </w:r>
-      <w:proofErr w:type="spellEnd"/>
+        <w:t xml:space="preserve">Razorpay Thirdwatch: </w:t>
+      </w:r>
+      <w:r>
+        <w:t>A popular fraud detection tool for Indian e-commerce and fintech companies. It provides rule-based fraud scoring and transaction monitoring but operates primarily on post-authorization analysis. Limited machine learning capabilities and no pre-authorization blocking.</w:t>
+      </w:r>
+    </w:p>
+    <w:p>
+      <w:pPr>
+        <w:pStyle w:val="ListText"/>
+        <w:ind w:left="1276"/>
+      </w:pPr>
+    </w:p>
+    <w:p>
+      <w:pPr>
+        <w:pStyle w:val="ListText"/>
+        <w:numPr>
+          <w:ilvl w:val="0"/>
+          <w:numId w:val="29"/>
+        </w:numPr>
+        <w:ind w:left="1276"/>
+      </w:pPr>
       <w:r>
         <w:rPr>
           <w:b/>
           <w:bCs/>
         </w:rPr>
-        <w:t xml:space="preserve"> Thirdwatch: </w:t>
-      </w:r>
-      <w:r>
-        <w:t>A popular fraud detection tool for Indian e-commerce and fintech companies. It provides rule-based fraud scoring and transaction monitoring but operates primarily on post-authorization analysis. Limited machine learning capabilities and no pre-authorization blocking.</w:t>
+        <w:t>Paytm Fraud Detection System:</w:t>
+      </w:r>
+      <w:r>
+        <w:t xml:space="preserve"> Internal fraud prevention system used by Paytm for wallet and UPI transactions. Uses basic velocity checks and rule-based patterns but details are proprietary and not accessible to third-party developers.</w:t>
       </w:r>
     </w:p>
     <w:p>
@@ -3984,10 +3668,11 @@
           <w:b/>
           <w:bCs/>
         </w:rPr>
-        <w:t>Paytm Fraud Detection System:</w:t>
-      </w:r>
-      <w:r>
-        <w:t xml:space="preserve"> Internal fraud prevention system used by Paytm for wallet and UPI transactions. Uses basic velocity checks and rule-based patterns but details are proprietary and not accessible to third-party developers.</w:t>
+        <w:lastRenderedPageBreak/>
+        <w:t>Simility (acquired by PayPal):</w:t>
+      </w:r>
+      <w:r>
+        <w:t xml:space="preserve"> Global fraud detection platform offering device fingerprinting and behavioral analytics. Strong on international fraud patterns but lacks specific detection for Indian fraud types like digital arrest scams or SIM swap attacks.</w:t>
       </w:r>
     </w:p>
     <w:p>
@@ -4005,82 +3690,109 @@
         </w:numPr>
         <w:ind w:left="1276"/>
       </w:pPr>
-      <w:proofErr w:type="spellStart"/>
       <w:r>
         <w:rPr>
           <w:b/>
           <w:bCs/>
         </w:rPr>
-        <w:lastRenderedPageBreak/>
-        <w:t>Simility</w:t>
-      </w:r>
-      <w:proofErr w:type="spellEnd"/>
+        <w:t>Kount:</w:t>
+      </w:r>
+      <w:r>
+        <w:t xml:space="preserve"> Enterprise fraud prevention platform used by global merchants. Provides AI-based risk scoring but requires significant setup, lacks India-specific threat intelligence, and is expensive for startups and small businesses.</w:t>
+      </w:r>
+    </w:p>
+    <w:p>
+      <w:pPr>
+        <w:pStyle w:val="ListText"/>
+        <w:ind w:left="1276"/>
+      </w:pPr>
+    </w:p>
+    <w:p>
+      <w:pPr>
+        <w:pStyle w:val="ListText"/>
+        <w:numPr>
+          <w:ilvl w:val="0"/>
+          <w:numId w:val="29"/>
+        </w:numPr>
+        <w:ind w:left="1276"/>
+      </w:pPr>
       <w:r>
         <w:rPr>
           <w:b/>
           <w:bCs/>
         </w:rPr>
-        <w:t xml:space="preserve"> (acquired by PayPal):</w:t>
-      </w:r>
-      <w:r>
-        <w:t xml:space="preserve"> Global fraud detection platform offering device fingerprinting and </w:t>
-      </w:r>
-      <w:proofErr w:type="spellStart"/>
-      <w:r>
-        <w:t>behavioral</w:t>
-      </w:r>
-      <w:proofErr w:type="spellEnd"/>
-      <w:r>
-        <w:t xml:space="preserve"> analytics. Strong on international fraud patterns but lacks specific detection for Indian fraud types like digital arrest scams or SIM swap attacks.</w:t>
-      </w:r>
-    </w:p>
-    <w:p>
-      <w:pPr>
-        <w:pStyle w:val="ListText"/>
-        <w:ind w:left="1276"/>
-      </w:pPr>
-    </w:p>
-    <w:p>
-      <w:pPr>
-        <w:pStyle w:val="ListText"/>
-        <w:numPr>
-          <w:ilvl w:val="0"/>
-          <w:numId w:val="29"/>
-        </w:numPr>
-        <w:ind w:left="1276"/>
-      </w:pPr>
-      <w:proofErr w:type="spellStart"/>
-      <w:r>
-        <w:rPr>
+        <w:t>Sift:</w:t>
+      </w:r>
+      <w:r>
+        <w:t xml:space="preserve"> Machine learning fraud detection focusing on account takeover and payment fraud. Primarily designed for US/European markets with limited understanding of UPI ecosystem threats.</w:t>
+      </w:r>
+    </w:p>
+    <w:p>
+      <w:pPr>
+        <w:pStyle w:val="ListText"/>
+      </w:pPr>
+    </w:p>
+    <w:p>
+      <w:pPr>
+        <w:rPr>
+          <w:rFonts w:ascii="Times New Roman" w:hAnsi="Times New Roman" w:cs="Times New Roman"/>
           <w:b/>
           <w:bCs/>
         </w:rPr>
-        <w:t>Kount</w:t>
-      </w:r>
-      <w:proofErr w:type="spellEnd"/>
+      </w:pPr>
+      <w:r>
+        <w:br w:type="page"/>
+      </w:r>
+    </w:p>
+    <w:p>
+      <w:pPr>
+        <w:pStyle w:val="ListSubheading"/>
+      </w:pPr>
+      <w:r>
+        <w:lastRenderedPageBreak/>
+        <w:t>Limitations of Existing Solutions</w:t>
+      </w:r>
+    </w:p>
+    <w:p>
+      <w:pPr>
+        <w:pStyle w:val="ListText"/>
+      </w:pPr>
+      <w:r>
+        <w:t>Current market solutions have several gaps that ARGUS addresses:</w:t>
+      </w:r>
+    </w:p>
+    <w:p>
+      <w:pPr>
+        <w:pStyle w:val="ListText"/>
+        <w:ind w:left="0"/>
+      </w:pPr>
+    </w:p>
+    <w:p>
+      <w:pPr>
+        <w:pStyle w:val="ListText"/>
+        <w:numPr>
+          <w:ilvl w:val="0"/>
+          <w:numId w:val="20"/>
+        </w:numPr>
+        <w:ind w:left="1276"/>
+      </w:pPr>
       <w:r>
         <w:rPr>
           <w:b/>
           <w:bCs/>
         </w:rPr>
-        <w:t>:</w:t>
-      </w:r>
-      <w:r>
-        <w:t xml:space="preserve"> Enterprise fraud prevention platform used by global merchants. Provides AI-based risk scoring but requires significant setup, lacks India-specific threat intelligence, and is expensive for startups and small businesses.</w:t>
-      </w:r>
-    </w:p>
-    <w:p>
-      <w:pPr>
-        <w:pStyle w:val="ListText"/>
-        <w:ind w:left="1276"/>
-      </w:pPr>
-    </w:p>
-    <w:p>
-      <w:pPr>
-        <w:pStyle w:val="ListText"/>
-        <w:numPr>
-          <w:ilvl w:val="0"/>
-          <w:numId w:val="29"/>
+        <w:t>Post-Authorization Focus:</w:t>
+      </w:r>
+      <w:r>
+        <w:t xml:space="preserve"> Most tools analyze transactions after payment processing, making prevention impossible</w:t>
+      </w:r>
+    </w:p>
+    <w:p>
+      <w:pPr>
+        <w:pStyle w:val="ListText"/>
+        <w:numPr>
+          <w:ilvl w:val="0"/>
+          <w:numId w:val="20"/>
         </w:numPr>
         <w:ind w:left="1276"/>
       </w:pPr>
@@ -4089,51 +3801,31 @@
           <w:b/>
           <w:bCs/>
         </w:rPr>
-        <w:t>Sift:</w:t>
-      </w:r>
-      <w:r>
-        <w:t xml:space="preserve"> Machine learning fraud detection focusing on account takeover and payment fraud. Primarily designed for US/European markets with limited understanding of UPI ecosystem threats.</w:t>
-      </w:r>
-    </w:p>
-    <w:p>
-      <w:pPr>
-        <w:pStyle w:val="ListText"/>
-      </w:pPr>
-    </w:p>
-    <w:p>
-      <w:pPr>
-        <w:rPr>
-          <w:rFonts w:ascii="Times New Roman" w:hAnsi="Times New Roman" w:cs="Times New Roman"/>
+        <w:t>Generic Fraud Patterns:</w:t>
+      </w:r>
+      <w:r>
+        <w:t xml:space="preserve"> Built for Western markets, they miss India-specific attack vectors like digital arrest scams, mule account networks, and UPI-specific phishing</w:t>
+      </w:r>
+    </w:p>
+    <w:p>
+      <w:pPr>
+        <w:pStyle w:val="ListText"/>
+        <w:numPr>
+          <w:ilvl w:val="0"/>
+          <w:numId w:val="20"/>
+        </w:numPr>
+        <w:ind w:left="1276"/>
+      </w:pPr>
+      <w:r>
+        <w:rPr>
           <w:b/>
           <w:bCs/>
         </w:rPr>
-      </w:pPr>
-      <w:r>
-        <w:br w:type="page"/>
-      </w:r>
-    </w:p>
-    <w:p>
-      <w:pPr>
-        <w:pStyle w:val="ListSubheading"/>
-      </w:pPr>
-      <w:r>
-        <w:lastRenderedPageBreak/>
-        <w:t>Limitations of Existing Solutions</w:t>
-      </w:r>
-    </w:p>
-    <w:p>
-      <w:pPr>
-        <w:pStyle w:val="ListText"/>
-      </w:pPr>
-      <w:r>
-        <w:t>Current market solutions have several gaps that ARGUS addresses:</w:t>
-      </w:r>
-    </w:p>
-    <w:p>
-      <w:pPr>
-        <w:pStyle w:val="ListText"/>
-        <w:ind w:left="0"/>
-      </w:pPr>
+        <w:t>High Cost:</w:t>
+      </w:r>
+      <w:r>
+        <w:t xml:space="preserve"> Enterprise solutions are priced for large corporations, making them inaccessible to smaller fintech startups and payment services</w:t>
+      </w:r>
     </w:p>
     <w:p>
       <w:pPr>
@@ -4149,18 +3841,10 @@
           <w:b/>
           <w:bCs/>
         </w:rPr>
-        <w:t>Post-Authorization Focus:</w:t>
-      </w:r>
-      <w:r>
-        <w:t xml:space="preserve"> Most tools </w:t>
-      </w:r>
-      <w:proofErr w:type="spellStart"/>
-      <w:r>
-        <w:t>analyze</w:t>
-      </w:r>
-      <w:proofErr w:type="spellEnd"/>
-      <w:r>
-        <w:t xml:space="preserve"> transactions after payment processing, making prevention impossible</w:t>
+        <w:t>Black Box Models:</w:t>
+      </w:r>
+      <w:r>
+        <w:t xml:space="preserve"> Lack explainability in fraud decisions, making it difficult for analysts to understand and improve detection</w:t>
       </w:r>
     </w:p>
     <w:p>
@@ -4177,10 +3861,10 @@
           <w:b/>
           <w:bCs/>
         </w:rPr>
-        <w:t>Generic Fraud Patterns:</w:t>
-      </w:r>
-      <w:r>
-        <w:t xml:space="preserve"> Built for Western markets, they miss India-specific attack vectors like digital arrest scams, mule account networks, and UPI-specific phishing</w:t>
+        <w:t>No Pre-Authorization:</w:t>
+      </w:r>
+      <w:r>
+        <w:t xml:space="preserve"> Cannot block transactions before payment processing, only flag them after completion</w:t>
       </w:r>
     </w:p>
     <w:p>
@@ -4197,18 +3881,45 @@
           <w:b/>
           <w:bCs/>
         </w:rPr>
-        <w:t>High Cost:</w:t>
-      </w:r>
-      <w:r>
-        <w:t xml:space="preserve"> Enterprise solutions are priced for large corporations, making them inaccessible to smaller fintech startups and payment services</w:t>
-      </w:r>
-    </w:p>
-    <w:p>
-      <w:pPr>
-        <w:pStyle w:val="ListText"/>
-        <w:numPr>
-          <w:ilvl w:val="0"/>
-          <w:numId w:val="20"/>
+        <w:t xml:space="preserve">Limited Graph Analysis: </w:t>
+      </w:r>
+      <w:r>
+        <w:t>Most don't offer fraud ring detection through network analysis</w:t>
+      </w:r>
+    </w:p>
+    <w:p>
+      <w:pPr>
+        <w:pStyle w:val="ListText"/>
+        <w:ind w:left="916"/>
+      </w:pPr>
+    </w:p>
+    <w:p>
+      <w:pPr>
+        <w:pStyle w:val="ListSubheading"/>
+      </w:pPr>
+      <w:r>
+        <w:t>How ARGUS Differs</w:t>
+      </w:r>
+    </w:p>
+    <w:p>
+      <w:pPr>
+        <w:pStyle w:val="ListText"/>
+      </w:pPr>
+      <w:r>
+        <w:t>ARGUS fills these critical gaps by providing:</w:t>
+      </w:r>
+    </w:p>
+    <w:p>
+      <w:pPr>
+        <w:pStyle w:val="ListText"/>
+      </w:pPr>
+    </w:p>
+    <w:p>
+      <w:pPr>
+        <w:pStyle w:val="ListText"/>
+        <w:numPr>
+          <w:ilvl w:val="0"/>
+          <w:numId w:val="33"/>
         </w:numPr>
         <w:ind w:left="1276"/>
       </w:pPr>
@@ -4217,18 +3928,18 @@
           <w:b/>
           <w:bCs/>
         </w:rPr>
-        <w:t>Black Box Models:</w:t>
-      </w:r>
-      <w:r>
-        <w:t xml:space="preserve"> Lack explainability in fraud decisions, making it difficult for analysts to understand and improve detection</w:t>
-      </w:r>
-    </w:p>
-    <w:p>
-      <w:pPr>
-        <w:pStyle w:val="ListText"/>
-        <w:numPr>
-          <w:ilvl w:val="0"/>
-          <w:numId w:val="20"/>
+        <w:t>Pre-Authorization Decision Engine:</w:t>
+      </w:r>
+      <w:r>
+        <w:t xml:space="preserve"> Blocks fraud before payment processing</w:t>
+      </w:r>
+    </w:p>
+    <w:p>
+      <w:pPr>
+        <w:pStyle w:val="ListText"/>
+        <w:numPr>
+          <w:ilvl w:val="0"/>
+          <w:numId w:val="33"/>
         </w:numPr>
         <w:ind w:left="1276"/>
       </w:pPr>
@@ -4237,18 +3948,18 @@
           <w:b/>
           <w:bCs/>
         </w:rPr>
-        <w:t>No Pre-Authorization:</w:t>
-      </w:r>
-      <w:r>
-        <w:t xml:space="preserve"> Cannot block transactions before payment processing, only flag them after completion</w:t>
-      </w:r>
-    </w:p>
-    <w:p>
-      <w:pPr>
-        <w:pStyle w:val="ListText"/>
-        <w:numPr>
-          <w:ilvl w:val="0"/>
-          <w:numId w:val="20"/>
+        <w:t xml:space="preserve">India-Specific Threat Intelligence: </w:t>
+      </w:r>
+      <w:r>
+        <w:t>Purpose-built detection for digital arrest scams, SIM swap attacks, UPI phishing, and mule networks</w:t>
+      </w:r>
+    </w:p>
+    <w:p>
+      <w:pPr>
+        <w:pStyle w:val="ListText"/>
+        <w:numPr>
+          <w:ilvl w:val="0"/>
+          <w:numId w:val="33"/>
         </w:numPr>
         <w:ind w:left="1276"/>
       </w:pPr>
@@ -4257,38 +3968,11 @@
           <w:b/>
           <w:bCs/>
         </w:rPr>
-        <w:t xml:space="preserve">Limited Graph Analysis: </w:t>
-      </w:r>
-      <w:r>
-        <w:t>Most don't offer fraud ring detection through network analysis</w:t>
-      </w:r>
-    </w:p>
-    <w:p>
-      <w:pPr>
-        <w:pStyle w:val="ListText"/>
-        <w:ind w:left="916"/>
-      </w:pPr>
-    </w:p>
-    <w:p>
-      <w:pPr>
-        <w:pStyle w:val="ListSubheading"/>
-      </w:pPr>
-      <w:r>
-        <w:t>How ARGUS Differs</w:t>
-      </w:r>
-    </w:p>
-    <w:p>
-      <w:pPr>
-        <w:pStyle w:val="ListText"/>
-      </w:pPr>
-      <w:r>
-        <w:t>ARGUS fills these critical gaps by providing:</w:t>
-      </w:r>
-    </w:p>
-    <w:p>
-      <w:pPr>
-        <w:pStyle w:val="ListText"/>
-      </w:pPr>
+        <w:t xml:space="preserve">Explainable AI: </w:t>
+      </w:r>
+      <w:r>
+        <w:t>Every decision includes human-readable explanations</w:t>
+      </w:r>
     </w:p>
     <w:p>
       <w:pPr>
@@ -4304,10 +3988,10 @@
           <w:b/>
           <w:bCs/>
         </w:rPr>
-        <w:t>Pre-Authorization Decision Engine:</w:t>
-      </w:r>
-      <w:r>
-        <w:t xml:space="preserve"> Blocks fraud before payment processing</w:t>
+        <w:t>Graph-Based Fraud Ring Detection:</w:t>
+      </w:r>
+      <w:r>
+        <w:t xml:space="preserve"> Identifies organized fraud networks through relationship analysis</w:t>
       </w:r>
     </w:p>
     <w:p>
@@ -4324,10 +4008,10 @@
           <w:b/>
           <w:bCs/>
         </w:rPr>
-        <w:t xml:space="preserve">India-Specific Threat Intelligence: </w:t>
-      </w:r>
-      <w:r>
-        <w:t>Purpose-built detection for digital arrest scams, SIM swap attacks, UPI phishing, and mule networks</w:t>
+        <w:t>Open Architecture:</w:t>
+      </w:r>
+      <w:r>
+        <w:t xml:space="preserve"> Built as a prototype that can be extended and customized</w:t>
       </w:r>
     </w:p>
     <w:p>
@@ -4344,96 +4028,93 @@
           <w:b/>
           <w:bCs/>
         </w:rPr>
-        <w:t xml:space="preserve">Explainable AI: </w:t>
-      </w:r>
-      <w:r>
-        <w:t>Every decision includes human-readable explanations</w:t>
-      </w:r>
-    </w:p>
-    <w:p>
-      <w:pPr>
-        <w:pStyle w:val="ListText"/>
-        <w:numPr>
-          <w:ilvl w:val="0"/>
-          <w:numId w:val="33"/>
-        </w:numPr>
-        <w:ind w:left="1276"/>
-      </w:pPr>
-      <w:r>
+        <w:t>Cost-Effective:</w:t>
+      </w:r>
+      <w:r>
+        <w:t xml:space="preserve"> Designed for deployment by smaller organizations and startups</w:t>
+      </w:r>
+    </w:p>
+    <w:p>
+      <w:pPr>
+        <w:pStyle w:val="ListText"/>
+        <w:ind w:left="0"/>
         <w:rPr>
           <w:b/>
           <w:bCs/>
         </w:rPr>
-        <w:t>Graph-Based Fraud Ring Detection:</w:t>
-      </w:r>
-      <w:r>
-        <w:t xml:space="preserve"> Identifies organized fraud networks through relationship analysis</w:t>
-      </w:r>
-    </w:p>
-    <w:p>
-      <w:pPr>
-        <w:pStyle w:val="ListText"/>
-        <w:numPr>
-          <w:ilvl w:val="0"/>
-          <w:numId w:val="33"/>
-        </w:numPr>
-        <w:ind w:left="1276"/>
+      </w:pPr>
+    </w:p>
+    <w:p>
+      <w:pPr>
+        <w:pStyle w:val="List-Heading"/>
+      </w:pPr>
+      <w:r>
+        <w:t>Future Scope and Improvements</w:t>
+      </w:r>
+    </w:p>
+    <w:p>
+      <w:pPr>
+        <w:pStyle w:val="ListSubheading"/>
+      </w:pPr>
+      <w:r>
+        <w:t>Advanced Machine Learning Enhancements</w:t>
+      </w:r>
+    </w:p>
+    <w:p>
+      <w:pPr>
+        <w:pStyle w:val="ListText"/>
+        <w:numPr>
+          <w:ilvl w:val="0"/>
+          <w:numId w:val="36"/>
+        </w:numPr>
       </w:pPr>
       <w:r>
         <w:rPr>
           <w:b/>
           <w:bCs/>
         </w:rPr>
-        <w:t>Open Architecture:</w:t>
-      </w:r>
-      <w:r>
-        <w:t xml:space="preserve"> Built as a prototype that can be extended and customized</w:t>
-      </w:r>
-    </w:p>
-    <w:p>
-      <w:pPr>
-        <w:pStyle w:val="ListText"/>
-        <w:numPr>
-          <w:ilvl w:val="0"/>
-          <w:numId w:val="33"/>
-        </w:numPr>
-        <w:ind w:left="1276"/>
+        <w:t>Deep Learning Models:</w:t>
+      </w:r>
+      <w:r>
+        <w:t xml:space="preserve"> Implement LSTM and Transformer-based models for sequential transaction pattern analysis, capturing temporal dependencies that traditional models miss.</w:t>
+      </w:r>
+    </w:p>
+    <w:p>
+      <w:pPr>
+        <w:pStyle w:val="ListText"/>
+        <w:numPr>
+          <w:ilvl w:val="0"/>
+          <w:numId w:val="36"/>
+        </w:numPr>
       </w:pPr>
       <w:r>
         <w:rPr>
           <w:b/>
           <w:bCs/>
         </w:rPr>
-        <w:t>Cost-Effective:</w:t>
-      </w:r>
-      <w:r>
-        <w:t xml:space="preserve"> Designed for deployment by smaller organizations and startups</w:t>
-      </w:r>
-    </w:p>
-    <w:p>
-      <w:pPr>
-        <w:pStyle w:val="ListText"/>
-        <w:ind w:left="0"/>
+        <w:t>Federated Learning:</w:t>
+      </w:r>
+      <w:r>
+        <w:t xml:space="preserve"> Enable multiple financial institutions to collaboratively train fraud detection models without sharing sensitive customer data, improving detection across the ecosystem while maintaining privacy.</w:t>
+      </w:r>
+    </w:p>
+    <w:p>
+      <w:pPr>
+        <w:pStyle w:val="ListText"/>
+        <w:numPr>
+          <w:ilvl w:val="0"/>
+          <w:numId w:val="36"/>
+        </w:numPr>
+      </w:pPr>
+      <w:r>
         <w:rPr>
           <w:b/>
           <w:bCs/>
         </w:rPr>
-      </w:pPr>
-    </w:p>
-    <w:p>
-      <w:pPr>
-        <w:pStyle w:val="List-Heading"/>
-      </w:pPr>
-      <w:r>
-        <w:t>Future Scope and Improvements</w:t>
-      </w:r>
-    </w:p>
-    <w:p>
-      <w:pPr>
-        <w:pStyle w:val="ListSubheading"/>
-      </w:pPr>
-      <w:r>
-        <w:t>Advanced Machine Learning Enhancements</w:t>
+        <w:t>Reinforcement Learning:</w:t>
+      </w:r>
+      <w:r>
+        <w:t xml:space="preserve"> Develop adaptive fraud detection that learns from analyst feedback and evolves detection strategies in response to emerging fraud patterns.</w:t>
       </w:r>
     </w:p>
     <w:p>
@@ -4449,10 +4130,25 @@
           <w:b/>
           <w:bCs/>
         </w:rPr>
-        <w:t>Deep Learning Models:</w:t>
-      </w:r>
-      <w:r>
-        <w:t xml:space="preserve"> Implement LSTM and Transformer-based models for sequential transaction pattern analysis, capturing temporal dependencies that traditional models miss.</w:t>
+        <w:lastRenderedPageBreak/>
+        <w:t>AutoML Integration:</w:t>
+      </w:r>
+      <w:r>
+        <w:t xml:space="preserve"> Automate hyperparameter tuning and model selection to continuously optimize detection performance without manual intervention.</w:t>
+      </w:r>
+    </w:p>
+    <w:p>
+      <w:pPr>
+        <w:pStyle w:val="ListText"/>
+        <w:ind w:left="993"/>
+      </w:pPr>
+    </w:p>
+    <w:p>
+      <w:pPr>
+        <w:pStyle w:val="ListSubheading"/>
+      </w:pPr>
+      <w:r>
+        <w:t>Enhanced Feature Engineering</w:t>
       </w:r>
     </w:p>
     <w:p>
@@ -4468,10 +4164,10 @@
           <w:b/>
           <w:bCs/>
         </w:rPr>
-        <w:t>Federated Learning:</w:t>
-      </w:r>
-      <w:r>
-        <w:t xml:space="preserve"> Enable multiple financial institutions to collaboratively train fraud detection models without sharing sensitive customer data, improving detection across the ecosystem while maintaining privacy.</w:t>
+        <w:t>Behavioral Biometrics:</w:t>
+      </w:r>
+      <w:r>
+        <w:t xml:space="preserve"> Integrate typing patterns, touch pressure, swipe gestures, and device motion data to create unique user behavioral signatures that are difficult for fraudsters to replicate.</w:t>
       </w:r>
     </w:p>
     <w:p>
@@ -4487,10 +4183,16 @@
           <w:b/>
           <w:bCs/>
         </w:rPr>
-        <w:t>Reinforcement Learning:</w:t>
-      </w:r>
-      <w:r>
-        <w:t xml:space="preserve"> Develop adaptive fraud detection that learns from analyst feedback and evolves detection strategies in response to emerging fraud patterns.</w:t>
+        <w:t xml:space="preserve">Advanced Device Fingerprinting: </w:t>
+      </w:r>
+      <w:r>
+        <w:t>Implement canvas fingerprinting, WebGL analysis, and hardware-level device signatures to improve device identification a</w:t>
+      </w:r>
+      <w:r>
+        <w:t>c</w:t>
+      </w:r>
+      <w:r>
+        <w:t>curacy.</w:t>
       </w:r>
     </w:p>
     <w:p>
@@ -4501,25 +4203,34 @@
           <w:numId w:val="36"/>
         </w:numPr>
       </w:pPr>
-      <w:proofErr w:type="spellStart"/>
       <w:r>
         <w:rPr>
           <w:b/>
           <w:bCs/>
         </w:rPr>
-        <w:lastRenderedPageBreak/>
-        <w:t>AutoML</w:t>
-      </w:r>
-      <w:proofErr w:type="spellEnd"/>
+        <w:t xml:space="preserve">Social Network Analysis: </w:t>
+      </w:r>
+      <w:r>
+        <w:t>Incorporate user social connections and transaction patterns within friend networks to identify anomalous behavior.</w:t>
+      </w:r>
+    </w:p>
+    <w:p>
+      <w:pPr>
+        <w:pStyle w:val="ListText"/>
+        <w:numPr>
+          <w:ilvl w:val="0"/>
+          <w:numId w:val="36"/>
+        </w:numPr>
+      </w:pPr>
       <w:r>
         <w:rPr>
           <w:b/>
           <w:bCs/>
         </w:rPr>
-        <w:t xml:space="preserve"> Integration:</w:t>
-      </w:r>
-      <w:r>
-        <w:t xml:space="preserve"> Automate hyperparameter tuning and model selection to continuously optimize detection performance without manual intervention.</w:t>
+        <w:t>Natural Language Processing:</w:t>
+      </w:r>
+      <w:r>
+        <w:t xml:space="preserve"> Analyze transaction descriptions, merchant names, and beneficiary details using NLP to detect phishing attempts and social engineering indicators.</w:t>
       </w:r>
     </w:p>
     <w:p>
@@ -4533,7 +4244,7 @@
         <w:pStyle w:val="ListSubheading"/>
       </w:pPr>
       <w:r>
-        <w:t>Enhanced Feature Engineering</w:t>
+        <w:t>Expanded Fraud Detection Capabilities</w:t>
       </w:r>
     </w:p>
     <w:p>
@@ -4544,57 +4255,41 @@
           <w:numId w:val="36"/>
         </w:numPr>
       </w:pPr>
-      <w:proofErr w:type="spellStart"/>
       <w:r>
         <w:rPr>
           <w:b/>
           <w:bCs/>
         </w:rPr>
-        <w:t>Behavioral</w:t>
-      </w:r>
-      <w:proofErr w:type="spellEnd"/>
+        <w:t xml:space="preserve">Cryptocurrency Fraud Detection: </w:t>
+      </w:r>
+      <w:r>
+        <w:t>Extend the system to detect fraud in crypto payments, NFT transactions, and DeFi platforms.</w:t>
+      </w:r>
+    </w:p>
+    <w:p>
+      <w:pPr>
+        <w:pStyle w:val="ListText"/>
+        <w:numPr>
+          <w:ilvl w:val="0"/>
+          <w:numId w:val="36"/>
+        </w:numPr>
+      </w:pPr>
       <w:r>
         <w:rPr>
           <w:b/>
           <w:bCs/>
         </w:rPr>
-        <w:t xml:space="preserve"> Biometrics:</w:t>
-      </w:r>
-      <w:r>
-        <w:t xml:space="preserve"> Integrate typing patterns, touch pressure, swipe gestures, and device motion data to create unique user </w:t>
-      </w:r>
-      <w:proofErr w:type="spellStart"/>
-      <w:r>
-        <w:t>behavioral</w:t>
-      </w:r>
-      <w:proofErr w:type="spellEnd"/>
-      <w:r>
-        <w:t xml:space="preserve"> signatures that are difficult for fraudsters to replicate.</w:t>
-      </w:r>
-    </w:p>
-    <w:p>
-      <w:pPr>
-        <w:pStyle w:val="ListText"/>
-        <w:numPr>
-          <w:ilvl w:val="0"/>
-          <w:numId w:val="36"/>
-        </w:numPr>
-      </w:pPr>
+        <w:t>C</w:t>
+      </w:r>
       <w:r>
         <w:rPr>
           <w:b/>
           <w:bCs/>
         </w:rPr>
-        <w:t xml:space="preserve">Advanced Device Fingerprinting: </w:t>
-      </w:r>
-      <w:r>
-        <w:t>Implement canvas fingerprinting, WebGL analysis, and hardware-level device signatures to improve device identification a</w:t>
-      </w:r>
-      <w:r>
-        <w:t>c</w:t>
-      </w:r>
-      <w:r>
-        <w:t>curacy.</w:t>
+        <w:t xml:space="preserve">ross-Channel Fraud Detection: </w:t>
+      </w:r>
+      <w:r>
+        <w:t>Track user behavior across multiple payment channels (UPI, cards, wallets, net banking) to identify sophisticated fraud patterns that span channels.</w:t>
       </w:r>
     </w:p>
     <w:p>
@@ -4610,18 +4305,10 @@
           <w:b/>
           <w:bCs/>
         </w:rPr>
-        <w:t xml:space="preserve">Social Network Analysis: </w:t>
-      </w:r>
-      <w:r>
-        <w:t xml:space="preserve">Incorporate user social connections and transaction patterns within friend networks to identify anomalous </w:t>
-      </w:r>
-      <w:proofErr w:type="spellStart"/>
-      <w:r>
-        <w:t>behavior</w:t>
-      </w:r>
-      <w:proofErr w:type="spellEnd"/>
-      <w:r>
-        <w:t>.</w:t>
+        <w:t xml:space="preserve">Synthetic Identity Detection: </w:t>
+      </w:r>
+      <w:r>
+        <w:t>Identify fraudulent accounts created using fabricated or stolen identity components.</w:t>
       </w:r>
     </w:p>
     <w:p>
@@ -4637,18 +4324,10 @@
           <w:b/>
           <w:bCs/>
         </w:rPr>
-        <w:t>Natural Language Processing:</w:t>
-      </w:r>
-      <w:r>
-        <w:t xml:space="preserve"> </w:t>
-      </w:r>
-      <w:proofErr w:type="spellStart"/>
-      <w:r>
-        <w:t>Analyze</w:t>
-      </w:r>
-      <w:proofErr w:type="spellEnd"/>
-      <w:r>
-        <w:t xml:space="preserve"> transaction descriptions, merchant names, and beneficiary details using NLP to detect phishing attempts and social engineering indicators.</w:t>
+        <w:t xml:space="preserve">First-Party Fraud Detection: </w:t>
+      </w:r>
+      <w:r>
+        <w:t>Detect legitimate users committing fraud through chargebacks, return fraud, or loan defaults.</w:t>
       </w:r>
     </w:p>
     <w:p>
@@ -4662,7 +4341,7 @@
         <w:pStyle w:val="ListSubheading"/>
       </w:pPr>
       <w:r>
-        <w:t>Expanded Fraud Detection Capabilities</w:t>
+        <w:t>Real-Time Collaboration Features</w:t>
       </w:r>
     </w:p>
     <w:p>
@@ -4678,10 +4357,10 @@
           <w:b/>
           <w:bCs/>
         </w:rPr>
-        <w:t xml:space="preserve">Cryptocurrency Fraud Detection: </w:t>
-      </w:r>
-      <w:r>
-        <w:t>Extend the system to detect fraud in crypto payments, NFT transactions, and DeFi platforms.</w:t>
+        <w:t xml:space="preserve">Industry Threat Intelligence Sharing: </w:t>
+      </w:r>
+      <w:r>
+        <w:t>Create a consortium model where financial institutions can share anonymized fraud patterns and threat intelligence in real-time.</w:t>
       </w:r>
     </w:p>
     <w:p>
@@ -4691,31 +4370,20 @@
           <w:ilvl w:val="0"/>
           <w:numId w:val="36"/>
         </w:numPr>
-      </w:pPr>
-      <w:r>
         <w:rPr>
           <w:b/>
           <w:bCs/>
         </w:rPr>
-        <w:t>C</w:t>
-      </w:r>
+      </w:pPr>
       <w:r>
         <w:rPr>
           <w:b/>
           <w:bCs/>
         </w:rPr>
-        <w:t xml:space="preserve">ross-Channel Fraud Detection: </w:t>
-      </w:r>
-      <w:r>
-        <w:t xml:space="preserve">Track user </w:t>
-      </w:r>
-      <w:proofErr w:type="spellStart"/>
-      <w:r>
-        <w:t>behavior</w:t>
-      </w:r>
-      <w:proofErr w:type="spellEnd"/>
-      <w:r>
-        <w:t xml:space="preserve"> across multiple payment channels (UPI, cards, wallets, net banking) to identify sophisticated fraud patterns that span channels.</w:t>
+        <w:t xml:space="preserve">Fraud Analyst Collaboration Platform: </w:t>
+      </w:r>
+      <w:r>
+        <w:t>Build features for fraud analysts across organizations to collaborate on investigating sophisticated fraud rings.</w:t>
       </w:r>
     </w:p>
     <w:p>
@@ -4731,10 +4399,24 @@
           <w:b/>
           <w:bCs/>
         </w:rPr>
-        <w:t xml:space="preserve">Synthetic Identity Detection: </w:t>
-      </w:r>
-      <w:r>
-        <w:t>Identify fraudulent accounts created using fabricated or stolen identity components.</w:t>
+        <w:t xml:space="preserve">Real-Time Fraud Alerts Network: </w:t>
+      </w:r>
+      <w:r>
+        <w:t>Implement instant alerts when known fraudsters attempt transactions across different platforms.</w:t>
+      </w:r>
+    </w:p>
+    <w:p>
+      <w:pPr>
+        <w:pStyle w:val="ListText"/>
+        <w:ind w:left="993"/>
+      </w:pPr>
+    </w:p>
+    <w:p>
+      <w:pPr>
+        <w:pStyle w:val="ListSubheading"/>
+      </w:pPr>
+      <w:r>
+        <w:t>Regulatory and Compliance Enhancements</w:t>
       </w:r>
     </w:p>
     <w:p>
@@ -4750,24 +4432,10 @@
           <w:b/>
           <w:bCs/>
         </w:rPr>
-        <w:t xml:space="preserve">First-Party Fraud Detection: </w:t>
-      </w:r>
-      <w:r>
-        <w:t>Detect legitimate users committing fraud through chargebacks, return fraud, or loan defaults.</w:t>
-      </w:r>
-    </w:p>
-    <w:p>
-      <w:pPr>
-        <w:pStyle w:val="ListText"/>
-        <w:ind w:left="993"/>
-      </w:pPr>
-    </w:p>
-    <w:p>
-      <w:pPr>
-        <w:pStyle w:val="ListSubheading"/>
-      </w:pPr>
-      <w:r>
-        <w:t>Real-Time Collaboration Features</w:t>
+        <w:t xml:space="preserve">Automated Regulatory Reporting: </w:t>
+      </w:r>
+      <w:r>
+        <w:t>Generate RBI, NPCI, and law enforcement reports automatically with required fraud statistics and suspicious activity reports (SAR).</w:t>
       </w:r>
     </w:p>
     <w:p>
@@ -4783,10 +4451,11 @@
           <w:b/>
           <w:bCs/>
         </w:rPr>
-        <w:t xml:space="preserve">Industry Threat Intelligence Sharing: </w:t>
-      </w:r>
-      <w:r>
-        <w:t>Create a consortium model where financial institutions can share anonymized fraud patterns and threat intelligence in real-time.</w:t>
+        <w:lastRenderedPageBreak/>
+        <w:t xml:space="preserve">GDPR/DPDP Act Full Compliance: </w:t>
+      </w:r>
+      <w:r>
+        <w:t>Implement complete data privacy controls including automated data deletion, consent management, and privacy-preserving analytics.</w:t>
       </w:r>
     </w:p>
     <w:p>
@@ -4796,20 +4465,49 @@
           <w:ilvl w:val="0"/>
           <w:numId w:val="36"/>
         </w:numPr>
+      </w:pPr>
+      <w:r>
         <w:rPr>
           <w:b/>
           <w:bCs/>
         </w:rPr>
+        <w:t xml:space="preserve">Blockchain-Based Audit Trail: </w:t>
+      </w:r>
+      <w:r>
+        <w:t>Use blockchain technology to create immutable audit trails for regulatory compliance and forensic investigation.</w:t>
+      </w:r>
+    </w:p>
+    <w:p>
+      <w:pPr>
+        <w:pStyle w:val="ListText"/>
+        <w:ind w:left="993"/>
+      </w:pPr>
+    </w:p>
+    <w:p>
+      <w:pPr>
+        <w:pStyle w:val="ListSubheading"/>
+      </w:pPr>
+      <w:r>
+        <w:t>User Experience Improvements</w:t>
+      </w:r>
+    </w:p>
+    <w:p>
+      <w:pPr>
+        <w:pStyle w:val="ListText"/>
+        <w:numPr>
+          <w:ilvl w:val="0"/>
+          <w:numId w:val="36"/>
+        </w:numPr>
       </w:pPr>
       <w:r>
         <w:rPr>
           <w:b/>
           <w:bCs/>
         </w:rPr>
-        <w:t xml:space="preserve">Fraud Analyst Collaboration Platform: </w:t>
-      </w:r>
-      <w:r>
-        <w:t>Build features for fraud analysts across organizations to collaborate on investigating sophisticated fraud rings.</w:t>
+        <w:t xml:space="preserve">Frictionless Authentication: </w:t>
+      </w:r>
+      <w:r>
+        <w:t>Implement step-up authentication that only challenges users when truly necessary, reducing false positives and improving customer experience.</w:t>
       </w:r>
     </w:p>
     <w:p>
@@ -4825,24 +4523,10 @@
           <w:b/>
           <w:bCs/>
         </w:rPr>
-        <w:t xml:space="preserve">Real-Time Fraud Alerts Network: </w:t>
-      </w:r>
-      <w:r>
-        <w:t>Implement instant alerts when known fraudsters attempt transactions across different platforms.</w:t>
-      </w:r>
-    </w:p>
-    <w:p>
-      <w:pPr>
-        <w:pStyle w:val="ListText"/>
-        <w:ind w:left="993"/>
-      </w:pPr>
-    </w:p>
-    <w:p>
-      <w:pPr>
-        <w:pStyle w:val="ListSubheading"/>
-      </w:pPr>
-      <w:r>
-        <w:t>Regulatory and Compliance Enhancements</w:t>
+        <w:t xml:space="preserve">Mobile App Integration: </w:t>
+      </w:r>
+      <w:r>
+        <w:t>Develop mobile SDKs for easy integration into payment apps with minimal development effort.</w:t>
       </w:r>
     </w:p>
     <w:p>
@@ -4858,10 +4542,24 @@
           <w:b/>
           <w:bCs/>
         </w:rPr>
-        <w:t xml:space="preserve">Automated Regulatory Reporting: </w:t>
-      </w:r>
-      <w:r>
-        <w:t>Generate RBI, NPCI, and law enforcement reports automatically with required fraud statistics and suspicious activity reports (SAR).</w:t>
+        <w:t xml:space="preserve">Customer Fraud Education: </w:t>
+      </w:r>
+      <w:r>
+        <w:t>Build in-app fraud awareness features that educate users about current fraud threats and prevention techniques.</w:t>
+      </w:r>
+    </w:p>
+    <w:p>
+      <w:pPr>
+        <w:pStyle w:val="ListText"/>
+        <w:ind w:left="993"/>
+      </w:pPr>
+    </w:p>
+    <w:p>
+      <w:pPr>
+        <w:pStyle w:val="ListSubheading"/>
+      </w:pPr>
+      <w:r>
+        <w:t>Scalability and Performance Optimization</w:t>
       </w:r>
     </w:p>
     <w:p>
@@ -4877,11 +4575,10 @@
           <w:b/>
           <w:bCs/>
         </w:rPr>
-        <w:lastRenderedPageBreak/>
-        <w:t xml:space="preserve">GDPR/DPDP Act Full Compliance: </w:t>
-      </w:r>
-      <w:r>
-        <w:t>Implement complete data privacy controls including automated data deletion, consent management, and privacy-preserving analytics.</w:t>
+        <w:t xml:space="preserve">Edge Computing: </w:t>
+      </w:r>
+      <w:r>
+        <w:t>Deploy lightweight fraud detection models at the edge for ultra-low latency in regional markets.</w:t>
       </w:r>
     </w:p>
     <w:p>
@@ -4891,49 +4588,20 @@
           <w:ilvl w:val="0"/>
           <w:numId w:val="36"/>
         </w:numPr>
-      </w:pPr>
-      <w:r>
         <w:rPr>
           <w:b/>
           <w:bCs/>
         </w:rPr>
-        <w:t xml:space="preserve">Blockchain-Based Audit Trail: </w:t>
-      </w:r>
-      <w:r>
-        <w:t>Use blockchain technology to create immutable audit trails for regulatory compliance and forensic investigation.</w:t>
-      </w:r>
-    </w:p>
-    <w:p>
-      <w:pPr>
-        <w:pStyle w:val="ListText"/>
-        <w:ind w:left="993"/>
-      </w:pPr>
-    </w:p>
-    <w:p>
-      <w:pPr>
-        <w:pStyle w:val="ListSubheading"/>
-      </w:pPr>
-      <w:r>
-        <w:t>User Experience Improvements</w:t>
-      </w:r>
-    </w:p>
-    <w:p>
-      <w:pPr>
-        <w:pStyle w:val="ListText"/>
-        <w:numPr>
-          <w:ilvl w:val="0"/>
-          <w:numId w:val="36"/>
-        </w:numPr>
       </w:pPr>
       <w:r>
         <w:rPr>
           <w:b/>
           <w:bCs/>
         </w:rPr>
-        <w:t xml:space="preserve">Frictionless Authentication: </w:t>
-      </w:r>
-      <w:r>
-        <w:t>Implement step-up authentication that only challenges users when truly necessary, reducing false positives and improving customer experience.</w:t>
+        <w:t xml:space="preserve">Real-Time Model Updates: </w:t>
+      </w:r>
+      <w:r>
+        <w:t>Implement online learning capabilities where models update continuously based on new fraud patterns without full retraining.</w:t>
       </w:r>
     </w:p>
     <w:p>
@@ -4949,10 +4617,10 @@
           <w:b/>
           <w:bCs/>
         </w:rPr>
-        <w:t xml:space="preserve">Mobile App Integration: </w:t>
-      </w:r>
-      <w:r>
-        <w:t>Develop mobile SDKs for easy integration into payment apps with minimal development effort.</w:t>
+        <w:t xml:space="preserve">Multi-Region Deployment: </w:t>
+      </w:r>
+      <w:r>
+        <w:t>Scale to active-active multi-region architecture with global threat intelligence sharing.</w:t>
       </w:r>
     </w:p>
     <w:p>
@@ -4968,10 +4636,10 @@
           <w:b/>
           <w:bCs/>
         </w:rPr>
-        <w:t xml:space="preserve">Customer Fraud Education: </w:t>
-      </w:r>
-      <w:r>
-        <w:t>Build in-app fraud awareness features that educate users about current fraud threats and prevention techniques.</w:t>
+        <w:t xml:space="preserve">Microservices Enhancement: </w:t>
+      </w:r>
+      <w:r>
+        <w:t>Further decompose the system into specialized microservices for better scalability and independent deployment.</w:t>
       </w:r>
     </w:p>
     <w:p>
@@ -4985,7 +4653,7 @@
         <w:pStyle w:val="ListSubheading"/>
       </w:pPr>
       <w:r>
-        <w:t>Scalability and Performance Optimization</w:t>
+        <w:t>Integration Capabilities</w:t>
       </w:r>
     </w:p>
     <w:p>
@@ -5001,10 +4669,10 @@
           <w:b/>
           <w:bCs/>
         </w:rPr>
-        <w:t xml:space="preserve">Edge Computing: </w:t>
-      </w:r>
-      <w:r>
-        <w:t>Deploy lightweight fraud detection models at the edge for ultra-low latency in regional markets.</w:t>
+        <w:t xml:space="preserve">Payment Gateway Plugins: </w:t>
+      </w:r>
+      <w:r>
+        <w:t>Develop ready-to-use plugins for popular payment gateways like Razorpay, Cashfree, and PayU.</w:t>
       </w:r>
     </w:p>
     <w:p>
@@ -5014,168 +4682,50 @@
           <w:ilvl w:val="0"/>
           <w:numId w:val="36"/>
         </w:numPr>
+      </w:pPr>
+      <w:r>
         <w:rPr>
           <w:b/>
           <w:bCs/>
         </w:rPr>
+        <w:t xml:space="preserve">Banking API Integration: </w:t>
+      </w:r>
+      <w:r>
+        <w:t>Create standardized connectors for bank account verification, KYC, and transaction history APIs.</w:t>
+      </w:r>
+    </w:p>
+    <w:p>
+      <w:pPr>
+        <w:pStyle w:val="ListText"/>
+        <w:numPr>
+          <w:ilvl w:val="0"/>
+          <w:numId w:val="36"/>
+        </w:numPr>
       </w:pPr>
       <w:r>
         <w:rPr>
           <w:b/>
           <w:bCs/>
         </w:rPr>
-        <w:t xml:space="preserve">Real-Time Model Updates: </w:t>
-      </w:r>
-      <w:r>
-        <w:t>Implement online learning capabilities where models update continuously based on new fraud patterns without full retraining.</w:t>
-      </w:r>
-    </w:p>
-    <w:p>
-      <w:pPr>
-        <w:pStyle w:val="ListText"/>
-        <w:numPr>
-          <w:ilvl w:val="0"/>
-          <w:numId w:val="36"/>
-        </w:numPr>
-      </w:pPr>
-      <w:r>
-        <w:rPr>
+        <w:t xml:space="preserve">SIEM Integration: </w:t>
+      </w:r>
+      <w:r>
+        <w:t>Enhance security information and event management system integration for enterprise security operations centers.</w:t>
+      </w:r>
+    </w:p>
+    <w:p>
+      <w:pPr>
+        <w:pStyle w:val="ListText"/>
+        <w:ind w:left="993"/>
+      </w:pPr>
+    </w:p>
+    <w:p>
+      <w:pPr>
+        <w:rPr>
+          <w:rFonts w:ascii="Times New Roman" w:hAnsi="Times New Roman" w:cs="Times New Roman"/>
           <w:b/>
           <w:bCs/>
         </w:rPr>
-        <w:t xml:space="preserve">Multi-Region Deployment: </w:t>
-      </w:r>
-      <w:r>
-        <w:t>Scale to active-active multi-region architecture with global threat intelligence sharing.</w:t>
-      </w:r>
-    </w:p>
-    <w:p>
-      <w:pPr>
-        <w:pStyle w:val="ListText"/>
-        <w:numPr>
-          <w:ilvl w:val="0"/>
-          <w:numId w:val="36"/>
-        </w:numPr>
-      </w:pPr>
-      <w:r>
-        <w:rPr>
-          <w:b/>
-          <w:bCs/>
-        </w:rPr>
-        <w:t xml:space="preserve">Microservices Enhancement: </w:t>
-      </w:r>
-      <w:r>
-        <w:t>Further decompose the system into specialized microservices for better scalability and independent deployment.</w:t>
-      </w:r>
-    </w:p>
-    <w:p>
-      <w:pPr>
-        <w:pStyle w:val="ListText"/>
-        <w:ind w:left="993"/>
-      </w:pPr>
-    </w:p>
-    <w:p>
-      <w:pPr>
-        <w:pStyle w:val="ListSubheading"/>
-      </w:pPr>
-      <w:r>
-        <w:t>Integration Capabilities</w:t>
-      </w:r>
-    </w:p>
-    <w:p>
-      <w:pPr>
-        <w:pStyle w:val="ListText"/>
-        <w:numPr>
-          <w:ilvl w:val="0"/>
-          <w:numId w:val="36"/>
-        </w:numPr>
-      </w:pPr>
-      <w:r>
-        <w:rPr>
-          <w:b/>
-          <w:bCs/>
-        </w:rPr>
-        <w:t xml:space="preserve">Payment Gateway Plugins: </w:t>
-      </w:r>
-      <w:r>
-        <w:t xml:space="preserve">Develop ready-to-use plugins for popular payment gateways like </w:t>
-      </w:r>
-      <w:proofErr w:type="spellStart"/>
-      <w:r>
-        <w:t>Razorpay</w:t>
-      </w:r>
-      <w:proofErr w:type="spellEnd"/>
-      <w:r>
-        <w:t xml:space="preserve">, </w:t>
-      </w:r>
-      <w:proofErr w:type="spellStart"/>
-      <w:r>
-        <w:t>Cashfree</w:t>
-      </w:r>
-      <w:proofErr w:type="spellEnd"/>
-      <w:r>
-        <w:t>, and PayU.</w:t>
-      </w:r>
-    </w:p>
-    <w:p>
-      <w:pPr>
-        <w:pStyle w:val="ListText"/>
-        <w:numPr>
-          <w:ilvl w:val="0"/>
-          <w:numId w:val="36"/>
-        </w:numPr>
-      </w:pPr>
-      <w:r>
-        <w:rPr>
-          <w:b/>
-          <w:bCs/>
-        </w:rPr>
-        <w:t xml:space="preserve">Banking API Integration: </w:t>
-      </w:r>
-      <w:r>
-        <w:t>Create standardized connectors for bank account verification, KYC, and transaction history APIs.</w:t>
-      </w:r>
-    </w:p>
-    <w:p>
-      <w:pPr>
-        <w:pStyle w:val="ListText"/>
-        <w:numPr>
-          <w:ilvl w:val="0"/>
-          <w:numId w:val="36"/>
-        </w:numPr>
-      </w:pPr>
-      <w:r>
-        <w:rPr>
-          <w:b/>
-          <w:bCs/>
-        </w:rPr>
-        <w:t xml:space="preserve">SIEM Integration: </w:t>
-      </w:r>
-      <w:r>
-        <w:t xml:space="preserve">Enhance security information and event management system integration for enterprise security operations </w:t>
-      </w:r>
-      <w:proofErr w:type="spellStart"/>
-      <w:r>
-        <w:t>centers</w:t>
-      </w:r>
-      <w:proofErr w:type="spellEnd"/>
-      <w:r>
-        <w:t>.</w:t>
-      </w:r>
-    </w:p>
-    <w:p>
-      <w:pPr>
-        <w:pStyle w:val="ListText"/>
-        <w:ind w:left="993"/>
-      </w:pPr>
-    </w:p>
-    <w:p>
-      <w:pPr>
-        <w:rPr>
-          <w:rFonts w:ascii="Times New Roman" w:hAnsi="Times New Roman" w:cs="Times New Roman"/>
-          <w:b/>
-          <w:bCs/>
-        </w:rPr>
       </w:pPr>
       <w:r>
         <w:br w:type="page"/>
@@ -5220,31 +4770,7 @@
         <w:t>we are</w:t>
       </w:r>
       <w:r>
-        <w:t xml:space="preserve"> building a working prototype that demonstrates the power of combining machine learning with domain knowledge about India-specific fraud patterns. By using </w:t>
-      </w:r>
-      <w:proofErr w:type="spellStart"/>
-      <w:r>
-        <w:t>XGBoost</w:t>
-      </w:r>
-      <w:proofErr w:type="spellEnd"/>
-      <w:r>
-        <w:t xml:space="preserve"> and Isolation Forest models, </w:t>
-      </w:r>
-      <w:proofErr w:type="spellStart"/>
-      <w:r>
-        <w:t>analyzing</w:t>
-      </w:r>
-      <w:proofErr w:type="spellEnd"/>
-      <w:r>
-        <w:t xml:space="preserve"> transaction velocity and </w:t>
-      </w:r>
-      <w:proofErr w:type="spellStart"/>
-      <w:r>
-        <w:t>behavioral</w:t>
-      </w:r>
-      <w:proofErr w:type="spellEnd"/>
-      <w:r>
-        <w:t xml:space="preserve"> patterns, and providing explainable AI decisions, ARGUS shows that effective fraud prevention is achievable with modern technology and thoughtful design.</w:t>
+        <w:t xml:space="preserve"> building a working prototype that demonstrates the power of combining machine learning with domain knowledge about India-specific fraud patterns. By using XGBoost and Isolation Forest models, analyzing transaction velocity and behavioral patterns, and providing explainable AI decisions, ARGUS shows that effective fraud prevention is achievable with modern technology and thoughtful design.</w:t>
       </w:r>
     </w:p>
     <w:p>
@@ -5286,15 +4812,7 @@
         <w:t>we have</w:t>
       </w:r>
       <w:r>
-        <w:t xml:space="preserve"> identified shows that ARGUS is just the beginning. From federated learning to </w:t>
-      </w:r>
-      <w:proofErr w:type="spellStart"/>
-      <w:r>
-        <w:t>behavioral</w:t>
-      </w:r>
-      <w:proofErr w:type="spellEnd"/>
-      <w:r>
-        <w:t xml:space="preserve"> biometrics, from cryptocurrency fraud detection to blockchain-based audit trails, there are countless directions this work can expand. But first, we must prove the core concept works.</w:t>
+        <w:t xml:space="preserve"> identified shows that ARGUS is just the beginning. From federated learning to behavioral biometrics, from cryptocurrency fraud detection to blockchain-based audit trails, there are countless directions this work can expand. But first, we must prove the core concept works.</w:t>
       </w:r>
     </w:p>
     <w:sectPr>

</xml_diff>